<commit_message>
update acceptanceplan and cicd test
</commit_message>
<xml_diff>
--- a/acceptanceTest.docx
+++ b/acceptanceTest.docx
@@ -5,12 +5,20 @@
     <w:p>
       <w:pPr>
         <w:rPr>
-          <w:lang w:val="en-NL"/>
+          <w:rFonts w:ascii="Arial" w:hAnsi="Arial" w:cs="Arial"/>
+          <w:b/>
+          <w:bCs/>
+          <w:sz w:val="24"/>
+          <w:szCs w:val="24"/>
         </w:rPr>
       </w:pPr>
       <w:r>
         <w:rPr>
-          <w:lang w:val="en-NL"/>
+          <w:rFonts w:ascii="Arial" w:hAnsi="Arial" w:cs="Arial"/>
+          <w:b/>
+          <w:bCs/>
+          <w:sz w:val="24"/>
+          <w:szCs w:val="24"/>
         </w:rPr>
         <w:t>Clanker Shooter - Acceptance Test Plan</w:t>
       </w:r>
@@ -18,34 +26,32 @@
     <w:p>
       <w:pPr>
         <w:rPr>
-          <w:lang w:val="en-NL"/>
+          <w:rFonts w:ascii="Arial" w:hAnsi="Arial" w:cs="Arial"/>
+          <w:sz w:val="24"/>
+          <w:szCs w:val="24"/>
         </w:rPr>
       </w:pPr>
       <w:r>
         <w:rPr>
-          <w:b/>
-          <w:bCs/>
-          <w:lang w:val="en-NL"/>
+          <w:rFonts w:ascii="Arial" w:hAnsi="Arial" w:cs="Arial"/>
+          <w:sz w:val="24"/>
+          <w:szCs w:val="24"/>
         </w:rPr>
-        <w:t>Introduction: When is the project "Done"</w:t>
+        <w:t xml:space="preserve">This document serves as the acceptance procedure to validate the implementation of the </w:t>
       </w:r>
       <w:r>
         <w:rPr>
-          <w:lang w:val="en-NL"/>
-        </w:rPr>
-        <w:t xml:space="preserve"> This document serves as the acceptance procedure to validate the implementation of the </w:t>
-      </w:r>
-      <w:r>
-        <w:rPr>
-          <w:b/>
-          <w:bCs/>
-          <w:lang w:val="en-NL"/>
+          <w:rFonts w:ascii="Arial" w:hAnsi="Arial" w:cs="Arial"/>
+          <w:sz w:val="24"/>
+          <w:szCs w:val="24"/>
         </w:rPr>
         <w:t>Clanker Shooter</w:t>
       </w:r>
       <w:r>
         <w:rPr>
-          <w:lang w:val="en-NL"/>
+          <w:rFonts w:ascii="Arial" w:hAnsi="Arial" w:cs="Arial"/>
+          <w:sz w:val="24"/>
+          <w:szCs w:val="24"/>
         </w:rPr>
         <w:t xml:space="preserve"> project. The overarching goal of this project is to bridge the gap between traditional handheld games and VR immersion by creating a standalone AR-gun prop.</w:t>
       </w:r>
@@ -53,12 +59,16 @@
     <w:p>
       <w:pPr>
         <w:rPr>
-          <w:lang w:val="en-NL"/>
+          <w:rFonts w:ascii="Arial" w:hAnsi="Arial" w:cs="Arial"/>
+          <w:sz w:val="24"/>
+          <w:szCs w:val="24"/>
         </w:rPr>
       </w:pPr>
       <w:r>
         <w:rPr>
-          <w:lang w:val="en-NL"/>
+          <w:rFonts w:ascii="Arial" w:hAnsi="Arial" w:cs="Arial"/>
+          <w:sz w:val="24"/>
+          <w:szCs w:val="24"/>
         </w:rPr>
         <w:t>The project is considered technically "done" and successful when the hardware, software, and physical components are integrated into a working prototype. At a minimum, the system must fulfill the "Must Have" scope requirements: it must feature a constructed physical wooden prop, functioning trigger and reload buttons, and a screen where the player can aim at circular targets and shoot them to make them disappear.</w:t>
       </w:r>
@@ -66,23 +76,29 @@
     <w:p>
       <w:pPr>
         <w:rPr>
-          <w:lang w:val="en-NL"/>
+          <w:rFonts w:ascii="Arial" w:hAnsi="Arial" w:cs="Arial"/>
+          <w:sz w:val="24"/>
+          <w:szCs w:val="24"/>
         </w:rPr>
       </w:pPr>
     </w:p>
     <w:p>
       <w:pPr>
         <w:rPr>
+          <w:rFonts w:ascii="Arial" w:hAnsi="Arial" w:cs="Arial"/>
           <w:b/>
           <w:bCs/>
-          <w:lang w:val="en-NL"/>
+          <w:sz w:val="24"/>
+          <w:szCs w:val="24"/>
         </w:rPr>
       </w:pPr>
       <w:r>
         <w:rPr>
+          <w:rFonts w:ascii="Arial" w:hAnsi="Arial" w:cs="Arial"/>
           <w:b/>
           <w:bCs/>
-          <w:lang w:val="en-NL"/>
+          <w:sz w:val="24"/>
+          <w:szCs w:val="24"/>
         </w:rPr>
         <w:t>Acceptance Checklist</w:t>
       </w:r>
@@ -105,11 +121,20 @@
             <w:tcW w:w="2254" w:type="dxa"/>
           </w:tcPr>
           <w:p>
-            <w:r>
-              <w:rPr>
+            <w:pPr>
+              <w:rPr>
+                <w:rFonts w:ascii="Arial" w:hAnsi="Arial" w:cs="Arial"/>
+                <w:sz w:val="24"/>
+                <w:szCs w:val="24"/>
+              </w:rPr>
+            </w:pPr>
+            <w:r>
+              <w:rPr>
+                <w:rFonts w:ascii="Arial" w:hAnsi="Arial" w:cs="Arial"/>
                 <w:b/>
                 <w:bCs/>
-                <w:lang w:val="en-NL"/>
+                <w:sz w:val="24"/>
+                <w:szCs w:val="24"/>
               </w:rPr>
               <w:t>Feature / Component</w:t>
             </w:r>
@@ -120,11 +145,20 @@
             <w:tcW w:w="2254" w:type="dxa"/>
           </w:tcPr>
           <w:p>
-            <w:r>
-              <w:rPr>
+            <w:pPr>
+              <w:rPr>
+                <w:rFonts w:ascii="Arial" w:hAnsi="Arial" w:cs="Arial"/>
+                <w:sz w:val="24"/>
+                <w:szCs w:val="24"/>
+              </w:rPr>
+            </w:pPr>
+            <w:r>
+              <w:rPr>
+                <w:rFonts w:ascii="Arial" w:hAnsi="Arial" w:cs="Arial"/>
                 <w:b/>
                 <w:bCs/>
-                <w:lang w:val="en-NL"/>
+                <w:sz w:val="24"/>
+                <w:szCs w:val="24"/>
               </w:rPr>
               <w:t>Category</w:t>
             </w:r>
@@ -135,11 +169,20 @@
             <w:tcW w:w="2254" w:type="dxa"/>
           </w:tcPr>
           <w:p>
-            <w:r>
-              <w:rPr>
+            <w:pPr>
+              <w:rPr>
+                <w:rFonts w:ascii="Arial" w:hAnsi="Arial" w:cs="Arial"/>
+                <w:sz w:val="24"/>
+                <w:szCs w:val="24"/>
+              </w:rPr>
+            </w:pPr>
+            <w:r>
+              <w:rPr>
+                <w:rFonts w:ascii="Arial" w:hAnsi="Arial" w:cs="Arial"/>
                 <w:b/>
                 <w:bCs/>
-                <w:lang w:val="en-NL"/>
+                <w:sz w:val="24"/>
+                <w:szCs w:val="24"/>
               </w:rPr>
               <w:t>How to Test (Validation Steps)</w:t>
             </w:r>
@@ -150,11 +193,20 @@
             <w:tcW w:w="2254" w:type="dxa"/>
           </w:tcPr>
           <w:p>
-            <w:r>
-              <w:rPr>
+            <w:pPr>
+              <w:rPr>
+                <w:rFonts w:ascii="Arial" w:hAnsi="Arial" w:cs="Arial"/>
+                <w:sz w:val="24"/>
+                <w:szCs w:val="24"/>
+              </w:rPr>
+            </w:pPr>
+            <w:r>
+              <w:rPr>
+                <w:rFonts w:ascii="Arial" w:hAnsi="Arial" w:cs="Arial"/>
                 <w:b/>
                 <w:bCs/>
-                <w:lang w:val="en-NL"/>
+                <w:sz w:val="24"/>
+                <w:szCs w:val="24"/>
               </w:rPr>
               <w:t>Status (Done / Not Done)</w:t>
             </w:r>
@@ -167,11 +219,20 @@
             <w:tcW w:w="2254" w:type="dxa"/>
           </w:tcPr>
           <w:p>
-            <w:r>
-              <w:rPr>
+            <w:pPr>
+              <w:rPr>
+                <w:rFonts w:ascii="Arial" w:hAnsi="Arial" w:cs="Arial"/>
+                <w:sz w:val="24"/>
+                <w:szCs w:val="24"/>
+              </w:rPr>
+            </w:pPr>
+            <w:r>
+              <w:rPr>
+                <w:rFonts w:ascii="Arial" w:hAnsi="Arial" w:cs="Arial"/>
                 <w:b/>
                 <w:bCs/>
-                <w:lang w:val="en-NL"/>
+                <w:sz w:val="24"/>
+                <w:szCs w:val="24"/>
               </w:rPr>
               <w:t>GitLab SSH Access</w:t>
             </w:r>
@@ -182,9 +243,18 @@
             <w:tcW w:w="2254" w:type="dxa"/>
           </w:tcPr>
           <w:p>
-            <w:r>
-              <w:rPr>
-                <w:lang w:val="en-NL"/>
+            <w:pPr>
+              <w:rPr>
+                <w:rFonts w:ascii="Arial" w:hAnsi="Arial" w:cs="Arial"/>
+                <w:sz w:val="24"/>
+                <w:szCs w:val="24"/>
+              </w:rPr>
+            </w:pPr>
+            <w:r>
+              <w:rPr>
+                <w:rFonts w:ascii="Arial" w:hAnsi="Arial" w:cs="Arial"/>
+                <w:sz w:val="24"/>
+                <w:szCs w:val="24"/>
               </w:rPr>
               <w:t>Setup</w:t>
             </w:r>
@@ -195,9 +265,18 @@
             <w:tcW w:w="2254" w:type="dxa"/>
           </w:tcPr>
           <w:p>
-            <w:r>
-              <w:rPr>
-                <w:lang w:val="en-NL"/>
+            <w:pPr>
+              <w:rPr>
+                <w:rFonts w:ascii="Arial" w:hAnsi="Arial" w:cs="Arial"/>
+                <w:sz w:val="24"/>
+                <w:szCs w:val="24"/>
+              </w:rPr>
+            </w:pPr>
+            <w:r>
+              <w:rPr>
+                <w:rFonts w:ascii="Arial" w:hAnsi="Arial" w:cs="Arial"/>
+                <w:sz w:val="24"/>
+                <w:szCs w:val="24"/>
               </w:rPr>
               <w:t>Verify the old SSH key is deleted from the system and the newly generated .pub key is successfully used to push/pull code to the repository.</w:t>
             </w:r>
@@ -208,7 +287,19 @@
             <w:tcW w:w="2254" w:type="dxa"/>
           </w:tcPr>
           <w:p>
-            <w:r>
+            <w:pPr>
+              <w:rPr>
+                <w:rFonts w:ascii="Arial" w:hAnsi="Arial" w:cs="Arial"/>
+                <w:sz w:val="24"/>
+                <w:szCs w:val="24"/>
+              </w:rPr>
+            </w:pPr>
+            <w:r>
+              <w:rPr>
+                <w:rFonts w:ascii="Arial" w:hAnsi="Arial" w:cs="Arial"/>
+                <w:sz w:val="24"/>
+                <w:szCs w:val="24"/>
+              </w:rPr>
               <w:t>Done</w:t>
             </w:r>
           </w:p>
@@ -220,11 +311,20 @@
             <w:tcW w:w="2254" w:type="dxa"/>
           </w:tcPr>
           <w:p>
-            <w:r>
-              <w:rPr>
+            <w:pPr>
+              <w:rPr>
+                <w:rFonts w:ascii="Arial" w:hAnsi="Arial" w:cs="Arial"/>
+                <w:sz w:val="24"/>
+                <w:szCs w:val="24"/>
+              </w:rPr>
+            </w:pPr>
+            <w:r>
+              <w:rPr>
+                <w:rFonts w:ascii="Arial" w:hAnsi="Arial" w:cs="Arial"/>
                 <w:b/>
                 <w:bCs/>
-                <w:lang w:val="en-NL"/>
+                <w:sz w:val="24"/>
+                <w:szCs w:val="24"/>
               </w:rPr>
               <w:t>Physical Gun Prop</w:t>
             </w:r>
@@ -235,9 +335,18 @@
             <w:tcW w:w="2254" w:type="dxa"/>
           </w:tcPr>
           <w:p>
-            <w:r>
-              <w:rPr>
-                <w:lang w:val="en-NL"/>
+            <w:pPr>
+              <w:rPr>
+                <w:rFonts w:ascii="Arial" w:hAnsi="Arial" w:cs="Arial"/>
+                <w:sz w:val="24"/>
+                <w:szCs w:val="24"/>
+              </w:rPr>
+            </w:pPr>
+            <w:r>
+              <w:rPr>
+                <w:rFonts w:ascii="Arial" w:hAnsi="Arial" w:cs="Arial"/>
+                <w:sz w:val="24"/>
+                <w:szCs w:val="24"/>
               </w:rPr>
               <w:t>Hardware (Must Have)</w:t>
             </w:r>
@@ -248,9 +357,18 @@
             <w:tcW w:w="2254" w:type="dxa"/>
           </w:tcPr>
           <w:p>
-            <w:r>
-              <w:rPr>
-                <w:lang w:val="en-NL"/>
+            <w:pPr>
+              <w:rPr>
+                <w:rFonts w:ascii="Arial" w:hAnsi="Arial" w:cs="Arial"/>
+                <w:sz w:val="24"/>
+                <w:szCs w:val="24"/>
+              </w:rPr>
+            </w:pPr>
+            <w:r>
+              <w:rPr>
+                <w:rFonts w:ascii="Arial" w:hAnsi="Arial" w:cs="Arial"/>
+                <w:sz w:val="24"/>
+                <w:szCs w:val="24"/>
               </w:rPr>
               <w:t>Verify that the chosen wooden prop design (with the long, wide front) has been cut out and assembled.</w:t>
             </w:r>
@@ -261,7 +379,19 @@
             <w:tcW w:w="2254" w:type="dxa"/>
           </w:tcPr>
           <w:p>
-            <w:r>
+            <w:pPr>
+              <w:rPr>
+                <w:rFonts w:ascii="Arial" w:hAnsi="Arial" w:cs="Arial"/>
+                <w:sz w:val="24"/>
+                <w:szCs w:val="24"/>
+              </w:rPr>
+            </w:pPr>
+            <w:r>
+              <w:rPr>
+                <w:rFonts w:ascii="Arial" w:hAnsi="Arial" w:cs="Arial"/>
+                <w:sz w:val="24"/>
+                <w:szCs w:val="24"/>
+              </w:rPr>
               <w:t>Done</w:t>
             </w:r>
           </w:p>
@@ -273,11 +403,20 @@
             <w:tcW w:w="2254" w:type="dxa"/>
           </w:tcPr>
           <w:p>
-            <w:r>
-              <w:rPr>
+            <w:pPr>
+              <w:rPr>
+                <w:rFonts w:ascii="Arial" w:hAnsi="Arial" w:cs="Arial"/>
+                <w:sz w:val="24"/>
+                <w:szCs w:val="24"/>
+              </w:rPr>
+            </w:pPr>
+            <w:r>
+              <w:rPr>
+                <w:rFonts w:ascii="Arial" w:hAnsi="Arial" w:cs="Arial"/>
                 <w:b/>
                 <w:bCs/>
-                <w:lang w:val="en-NL"/>
+                <w:sz w:val="24"/>
+                <w:szCs w:val="24"/>
               </w:rPr>
               <w:t>Microcontroller &amp; Display</w:t>
             </w:r>
@@ -288,9 +427,18 @@
             <w:tcW w:w="2254" w:type="dxa"/>
           </w:tcPr>
           <w:p>
-            <w:r>
-              <w:rPr>
-                <w:lang w:val="en-NL"/>
+            <w:pPr>
+              <w:rPr>
+                <w:rFonts w:ascii="Arial" w:hAnsi="Arial" w:cs="Arial"/>
+                <w:sz w:val="24"/>
+                <w:szCs w:val="24"/>
+              </w:rPr>
+            </w:pPr>
+            <w:r>
+              <w:rPr>
+                <w:rFonts w:ascii="Arial" w:hAnsi="Arial" w:cs="Arial"/>
+                <w:sz w:val="24"/>
+                <w:szCs w:val="24"/>
               </w:rPr>
               <w:t>Hardware (Must Have)</w:t>
             </w:r>
@@ -301,9 +449,18 @@
             <w:tcW w:w="2254" w:type="dxa"/>
           </w:tcPr>
           <w:p>
-            <w:r>
-              <w:rPr>
-                <w:lang w:val="en-NL"/>
+            <w:pPr>
+              <w:rPr>
+                <w:rFonts w:ascii="Arial" w:hAnsi="Arial" w:cs="Arial"/>
+                <w:sz w:val="24"/>
+                <w:szCs w:val="24"/>
+              </w:rPr>
+            </w:pPr>
+            <w:r>
+              <w:rPr>
+                <w:rFonts w:ascii="Arial" w:hAnsi="Arial" w:cs="Arial"/>
+                <w:sz w:val="24"/>
+                <w:szCs w:val="24"/>
               </w:rPr>
               <w:t>Verify that the central processing board boots up and successfully renders the digital world to the integrated scope display.</w:t>
             </w:r>
@@ -314,7 +471,19 @@
             <w:tcW w:w="2254" w:type="dxa"/>
           </w:tcPr>
           <w:p>
-            <w:r>
+            <w:pPr>
+              <w:rPr>
+                <w:rFonts w:ascii="Arial" w:hAnsi="Arial" w:cs="Arial"/>
+                <w:sz w:val="24"/>
+                <w:szCs w:val="24"/>
+              </w:rPr>
+            </w:pPr>
+            <w:r>
+              <w:rPr>
+                <w:rFonts w:ascii="Arial" w:hAnsi="Arial" w:cs="Arial"/>
+                <w:sz w:val="24"/>
+                <w:szCs w:val="24"/>
+              </w:rPr>
               <w:t>Done</w:t>
             </w:r>
           </w:p>
@@ -326,11 +495,20 @@
             <w:tcW w:w="2254" w:type="dxa"/>
           </w:tcPr>
           <w:p>
-            <w:r>
-              <w:rPr>
+            <w:pPr>
+              <w:rPr>
+                <w:rFonts w:ascii="Arial" w:hAnsi="Arial" w:cs="Arial"/>
+                <w:sz w:val="24"/>
+                <w:szCs w:val="24"/>
+              </w:rPr>
+            </w:pPr>
+            <w:r>
+              <w:rPr>
+                <w:rFonts w:ascii="Arial" w:hAnsi="Arial" w:cs="Arial"/>
                 <w:b/>
                 <w:bCs/>
-                <w:lang w:val="en-NL"/>
+                <w:sz w:val="24"/>
+                <w:szCs w:val="24"/>
               </w:rPr>
               <w:t>Trigger &amp; Reload Buttons</w:t>
             </w:r>
@@ -341,9 +519,18 @@
             <w:tcW w:w="2254" w:type="dxa"/>
           </w:tcPr>
           <w:p>
-            <w:r>
-              <w:rPr>
-                <w:lang w:val="en-NL"/>
+            <w:pPr>
+              <w:rPr>
+                <w:rFonts w:ascii="Arial" w:hAnsi="Arial" w:cs="Arial"/>
+                <w:sz w:val="24"/>
+                <w:szCs w:val="24"/>
+              </w:rPr>
+            </w:pPr>
+            <w:r>
+              <w:rPr>
+                <w:rFonts w:ascii="Arial" w:hAnsi="Arial" w:cs="Arial"/>
+                <w:sz w:val="24"/>
+                <w:szCs w:val="24"/>
               </w:rPr>
               <w:t>Input (Must Have)</w:t>
             </w:r>
@@ -354,9 +541,18 @@
             <w:tcW w:w="2254" w:type="dxa"/>
           </w:tcPr>
           <w:p>
-            <w:r>
-              <w:rPr>
-                <w:lang w:val="en-NL"/>
+            <w:pPr>
+              <w:rPr>
+                <w:rFonts w:ascii="Arial" w:hAnsi="Arial" w:cs="Arial"/>
+                <w:sz w:val="24"/>
+                <w:szCs w:val="24"/>
+              </w:rPr>
+            </w:pPr>
+            <w:r>
+              <w:rPr>
+                <w:rFonts w:ascii="Arial" w:hAnsi="Arial" w:cs="Arial"/>
+                <w:sz w:val="24"/>
+                <w:szCs w:val="24"/>
               </w:rPr>
               <w:t>Press the physical trigger and reload buttons; verify that the microcontroller registers the tactile inputs immediately.</w:t>
             </w:r>
@@ -367,7 +563,19 @@
             <w:tcW w:w="2254" w:type="dxa"/>
           </w:tcPr>
           <w:p>
-            <w:r>
+            <w:pPr>
+              <w:rPr>
+                <w:rFonts w:ascii="Arial" w:hAnsi="Arial" w:cs="Arial"/>
+                <w:sz w:val="24"/>
+                <w:szCs w:val="24"/>
+              </w:rPr>
+            </w:pPr>
+            <w:r>
+              <w:rPr>
+                <w:rFonts w:ascii="Arial" w:hAnsi="Arial" w:cs="Arial"/>
+                <w:sz w:val="24"/>
+                <w:szCs w:val="24"/>
+              </w:rPr>
               <w:t>Not done</w:t>
             </w:r>
           </w:p>
@@ -379,11 +587,20 @@
             <w:tcW w:w="2254" w:type="dxa"/>
           </w:tcPr>
           <w:p>
-            <w:r>
-              <w:rPr>
+            <w:pPr>
+              <w:rPr>
+                <w:rFonts w:ascii="Arial" w:hAnsi="Arial" w:cs="Arial"/>
+                <w:sz w:val="24"/>
+                <w:szCs w:val="24"/>
+              </w:rPr>
+            </w:pPr>
+            <w:r>
+              <w:rPr>
+                <w:rFonts w:ascii="Arial" w:hAnsi="Arial" w:cs="Arial"/>
                 <w:b/>
                 <w:bCs/>
-                <w:lang w:val="en-NL"/>
+                <w:sz w:val="24"/>
+                <w:szCs w:val="24"/>
               </w:rPr>
               <w:t>IMU 360° Aiming</w:t>
             </w:r>
@@ -394,9 +611,18 @@
             <w:tcW w:w="2254" w:type="dxa"/>
           </w:tcPr>
           <w:p>
-            <w:r>
-              <w:rPr>
-                <w:lang w:val="en-NL"/>
+            <w:pPr>
+              <w:rPr>
+                <w:rFonts w:ascii="Arial" w:hAnsi="Arial" w:cs="Arial"/>
+                <w:sz w:val="24"/>
+                <w:szCs w:val="24"/>
+              </w:rPr>
+            </w:pPr>
+            <w:r>
+              <w:rPr>
+                <w:rFonts w:ascii="Arial" w:hAnsi="Arial" w:cs="Arial"/>
+                <w:sz w:val="24"/>
+                <w:szCs w:val="24"/>
               </w:rPr>
               <w:t>Integration (Must Have)</w:t>
             </w:r>
@@ -407,27 +633,50 @@
             <w:tcW w:w="2254" w:type="dxa"/>
           </w:tcPr>
           <w:p>
-            <w:r>
-              <w:rPr>
-                <w:lang w:val="en-NL"/>
-              </w:rPr>
-              <w:t xml:space="preserve">Physically turn and tilt the gun prop; verify the LSM6DSOX IMU accurately translates the movement into a </w:t>
-            </w:r>
-            <w:r>
-              <w:rPr>
-                <w:lang w:val="en-NL"/>
+            <w:pPr>
+              <w:rPr>
+                <w:rFonts w:ascii="Arial" w:hAnsi="Arial" w:cs="Arial"/>
+                <w:sz w:val="24"/>
+                <w:szCs w:val="24"/>
+              </w:rPr>
+            </w:pPr>
+            <w:r>
+              <w:rPr>
+                <w:rFonts w:ascii="Arial" w:hAnsi="Arial" w:cs="Arial"/>
+                <w:sz w:val="24"/>
+                <w:szCs w:val="24"/>
+              </w:rPr>
+              <w:t xml:space="preserve">Physically turn and tilt the gun prop; </w:t>
+            </w:r>
+            <w:r>
+              <w:rPr>
+                <w:rFonts w:ascii="Arial" w:hAnsi="Arial" w:cs="Arial"/>
+                <w:sz w:val="24"/>
+                <w:szCs w:val="24"/>
               </w:rPr>
               <w:lastRenderedPageBreak/>
-              <w:t>low-latency 360-degree view on the screen.</w:t>
-            </w:r>
-          </w:p>
-        </w:tc>
-        <w:tc>
-          <w:tcPr>
-            <w:tcW w:w="2254" w:type="dxa"/>
-          </w:tcPr>
-          <w:p>
-            <w:r>
+              <w:t>verify the LSM6DSOX IMU accurately translates the movement into a low-latency 360-degree view on the screen.</w:t>
+            </w:r>
+          </w:p>
+        </w:tc>
+        <w:tc>
+          <w:tcPr>
+            <w:tcW w:w="2254" w:type="dxa"/>
+          </w:tcPr>
+          <w:p>
+            <w:pPr>
+              <w:rPr>
+                <w:rFonts w:ascii="Arial" w:hAnsi="Arial" w:cs="Arial"/>
+                <w:sz w:val="24"/>
+                <w:szCs w:val="24"/>
+              </w:rPr>
+            </w:pPr>
+            <w:r>
+              <w:rPr>
+                <w:rFonts w:ascii="Arial" w:hAnsi="Arial" w:cs="Arial"/>
+                <w:sz w:val="24"/>
+                <w:szCs w:val="24"/>
+              </w:rPr>
               <w:lastRenderedPageBreak/>
               <w:t>done</w:t>
             </w:r>
@@ -440,11 +689,20 @@
             <w:tcW w:w="2254" w:type="dxa"/>
           </w:tcPr>
           <w:p>
-            <w:r>
-              <w:rPr>
+            <w:pPr>
+              <w:rPr>
+                <w:rFonts w:ascii="Arial" w:hAnsi="Arial" w:cs="Arial"/>
+                <w:sz w:val="24"/>
+                <w:szCs w:val="24"/>
+              </w:rPr>
+            </w:pPr>
+            <w:r>
+              <w:rPr>
+                <w:rFonts w:ascii="Arial" w:hAnsi="Arial" w:cs="Arial"/>
                 <w:b/>
                 <w:bCs/>
-                <w:lang w:val="en-NL"/>
+                <w:sz w:val="24"/>
+                <w:szCs w:val="24"/>
               </w:rPr>
               <w:t>Joystick Movement</w:t>
             </w:r>
@@ -455,9 +713,18 @@
             <w:tcW w:w="2254" w:type="dxa"/>
           </w:tcPr>
           <w:p>
-            <w:r>
-              <w:rPr>
-                <w:lang w:val="en-NL"/>
+            <w:pPr>
+              <w:rPr>
+                <w:rFonts w:ascii="Arial" w:hAnsi="Arial" w:cs="Arial"/>
+                <w:sz w:val="24"/>
+                <w:szCs w:val="24"/>
+              </w:rPr>
+            </w:pPr>
+            <w:r>
+              <w:rPr>
+                <w:rFonts w:ascii="Arial" w:hAnsi="Arial" w:cs="Arial"/>
+                <w:sz w:val="24"/>
+                <w:szCs w:val="24"/>
               </w:rPr>
               <w:t>Integration (Must Have)</w:t>
             </w:r>
@@ -468,9 +735,18 @@
             <w:tcW w:w="2254" w:type="dxa"/>
           </w:tcPr>
           <w:p>
-            <w:r>
-              <w:rPr>
-                <w:lang w:val="en-NL"/>
+            <w:pPr>
+              <w:rPr>
+                <w:rFonts w:ascii="Arial" w:hAnsi="Arial" w:cs="Arial"/>
+                <w:sz w:val="24"/>
+                <w:szCs w:val="24"/>
+              </w:rPr>
+            </w:pPr>
+            <w:r>
+              <w:rPr>
+                <w:rFonts w:ascii="Arial" w:hAnsi="Arial" w:cs="Arial"/>
+                <w:sz w:val="24"/>
+                <w:szCs w:val="24"/>
               </w:rPr>
               <w:t>Move the joystick; verify it allows the player to virtually walk forward and backward to compensate for the limited 2x2 meter physical space.</w:t>
             </w:r>
@@ -481,7 +757,19 @@
             <w:tcW w:w="2254" w:type="dxa"/>
           </w:tcPr>
           <w:p>
-            <w:r>
+            <w:pPr>
+              <w:rPr>
+                <w:rFonts w:ascii="Arial" w:hAnsi="Arial" w:cs="Arial"/>
+                <w:sz w:val="24"/>
+                <w:szCs w:val="24"/>
+              </w:rPr>
+            </w:pPr>
+            <w:r>
+              <w:rPr>
+                <w:rFonts w:ascii="Arial" w:hAnsi="Arial" w:cs="Arial"/>
+                <w:sz w:val="24"/>
+                <w:szCs w:val="24"/>
+              </w:rPr>
               <w:t>Not done</w:t>
             </w:r>
           </w:p>
@@ -493,11 +781,20 @@
             <w:tcW w:w="2254" w:type="dxa"/>
           </w:tcPr>
           <w:p>
-            <w:r>
-              <w:rPr>
+            <w:pPr>
+              <w:rPr>
+                <w:rFonts w:ascii="Arial" w:hAnsi="Arial" w:cs="Arial"/>
+                <w:sz w:val="24"/>
+                <w:szCs w:val="24"/>
+              </w:rPr>
+            </w:pPr>
+            <w:r>
+              <w:rPr>
+                <w:rFonts w:ascii="Arial" w:hAnsi="Arial" w:cs="Arial"/>
                 <w:b/>
                 <w:bCs/>
-                <w:lang w:val="en-NL"/>
+                <w:sz w:val="24"/>
+                <w:szCs w:val="24"/>
               </w:rPr>
               <w:t>Target Shooting</w:t>
             </w:r>
@@ -508,9 +805,18 @@
             <w:tcW w:w="2254" w:type="dxa"/>
           </w:tcPr>
           <w:p>
-            <w:r>
-              <w:rPr>
-                <w:lang w:val="en-NL"/>
+            <w:pPr>
+              <w:rPr>
+                <w:rFonts w:ascii="Arial" w:hAnsi="Arial" w:cs="Arial"/>
+                <w:sz w:val="24"/>
+                <w:szCs w:val="24"/>
+              </w:rPr>
+            </w:pPr>
+            <w:r>
+              <w:rPr>
+                <w:rFonts w:ascii="Arial" w:hAnsi="Arial" w:cs="Arial"/>
+                <w:sz w:val="24"/>
+                <w:szCs w:val="24"/>
               </w:rPr>
               <w:t>Software (Must Have)</w:t>
             </w:r>
@@ -521,9 +827,18 @@
             <w:tcW w:w="2254" w:type="dxa"/>
           </w:tcPr>
           <w:p>
-            <w:r>
-              <w:rPr>
-                <w:lang w:val="en-NL"/>
+            <w:pPr>
+              <w:rPr>
+                <w:rFonts w:ascii="Arial" w:hAnsi="Arial" w:cs="Arial"/>
+                <w:sz w:val="24"/>
+                <w:szCs w:val="24"/>
+              </w:rPr>
+            </w:pPr>
+            <w:r>
+              <w:rPr>
+                <w:rFonts w:ascii="Arial" w:hAnsi="Arial" w:cs="Arial"/>
+                <w:sz w:val="24"/>
+                <w:szCs w:val="24"/>
               </w:rPr>
               <w:t>Aim at the digital target circles and pull the trigger; verify the system registers the hit and the circles disappear.</w:t>
             </w:r>
@@ -534,7 +849,19 @@
             <w:tcW w:w="2254" w:type="dxa"/>
           </w:tcPr>
           <w:p>
-            <w:r>
+            <w:pPr>
+              <w:rPr>
+                <w:rFonts w:ascii="Arial" w:hAnsi="Arial" w:cs="Arial"/>
+                <w:sz w:val="24"/>
+                <w:szCs w:val="24"/>
+              </w:rPr>
+            </w:pPr>
+            <w:r>
+              <w:rPr>
+                <w:rFonts w:ascii="Arial" w:hAnsi="Arial" w:cs="Arial"/>
+                <w:sz w:val="24"/>
+                <w:szCs w:val="24"/>
+              </w:rPr>
               <w:t>Done</w:t>
             </w:r>
           </w:p>
@@ -546,11 +873,20 @@
             <w:tcW w:w="2254" w:type="dxa"/>
           </w:tcPr>
           <w:p>
-            <w:r>
-              <w:rPr>
+            <w:pPr>
+              <w:rPr>
+                <w:rFonts w:ascii="Arial" w:hAnsi="Arial" w:cs="Arial"/>
+                <w:sz w:val="24"/>
+                <w:szCs w:val="24"/>
+              </w:rPr>
+            </w:pPr>
+            <w:r>
+              <w:rPr>
+                <w:rFonts w:ascii="Arial" w:hAnsi="Arial" w:cs="Arial"/>
                 <w:b/>
                 <w:bCs/>
-                <w:lang w:val="en-NL"/>
+                <w:sz w:val="24"/>
+                <w:szCs w:val="24"/>
               </w:rPr>
               <w:t>Drift Correction (Reset)</w:t>
             </w:r>
@@ -561,9 +897,18 @@
             <w:tcW w:w="2254" w:type="dxa"/>
           </w:tcPr>
           <w:p>
-            <w:r>
-              <w:rPr>
-                <w:lang w:val="en-NL"/>
+            <w:pPr>
+              <w:rPr>
+                <w:rFonts w:ascii="Arial" w:hAnsi="Arial" w:cs="Arial"/>
+                <w:sz w:val="24"/>
+                <w:szCs w:val="24"/>
+              </w:rPr>
+            </w:pPr>
+            <w:r>
+              <w:rPr>
+                <w:rFonts w:ascii="Arial" w:hAnsi="Arial" w:cs="Arial"/>
+                <w:sz w:val="24"/>
+                <w:szCs w:val="24"/>
               </w:rPr>
               <w:t>Integration</w:t>
             </w:r>
@@ -574,9 +919,18 @@
             <w:tcW w:w="2254" w:type="dxa"/>
           </w:tcPr>
           <w:p>
-            <w:r>
-              <w:rPr>
-                <w:lang w:val="en-NL"/>
+            <w:pPr>
+              <w:rPr>
+                <w:rFonts w:ascii="Arial" w:hAnsi="Arial" w:cs="Arial"/>
+                <w:sz w:val="24"/>
+                <w:szCs w:val="24"/>
+              </w:rPr>
+            </w:pPr>
+            <w:r>
+              <w:rPr>
+                <w:rFonts w:ascii="Arial" w:hAnsi="Arial" w:cs="Arial"/>
+                <w:sz w:val="24"/>
+                <w:szCs w:val="24"/>
               </w:rPr>
               <w:t>Press the designated reset button; verify it manually corrects any sensor drift from the IMU and recalibrates the center point.</w:t>
             </w:r>
@@ -587,7 +941,19 @@
             <w:tcW w:w="2254" w:type="dxa"/>
           </w:tcPr>
           <w:p>
-            <w:r>
+            <w:pPr>
+              <w:rPr>
+                <w:rFonts w:ascii="Arial" w:hAnsi="Arial" w:cs="Arial"/>
+                <w:sz w:val="24"/>
+                <w:szCs w:val="24"/>
+              </w:rPr>
+            </w:pPr>
+            <w:r>
+              <w:rPr>
+                <w:rFonts w:ascii="Arial" w:hAnsi="Arial" w:cs="Arial"/>
+                <w:sz w:val="24"/>
+                <w:szCs w:val="24"/>
+              </w:rPr>
               <w:t>Not done</w:t>
             </w:r>
           </w:p>
@@ -599,11 +965,20 @@
             <w:tcW w:w="2254" w:type="dxa"/>
           </w:tcPr>
           <w:p>
-            <w:r>
-              <w:rPr>
+            <w:pPr>
+              <w:rPr>
+                <w:rFonts w:ascii="Arial" w:hAnsi="Arial" w:cs="Arial"/>
+                <w:sz w:val="24"/>
+                <w:szCs w:val="24"/>
+              </w:rPr>
+            </w:pPr>
+            <w:r>
+              <w:rPr>
+                <w:rFonts w:ascii="Arial" w:hAnsi="Arial" w:cs="Arial"/>
                 <w:b/>
                 <w:bCs/>
-                <w:lang w:val="en-NL"/>
+                <w:sz w:val="24"/>
+                <w:szCs w:val="24"/>
               </w:rPr>
               <w:t>Zoom Potentiometer</w:t>
             </w:r>
@@ -614,9 +989,18 @@
             <w:tcW w:w="2254" w:type="dxa"/>
           </w:tcPr>
           <w:p>
-            <w:r>
-              <w:rPr>
-                <w:lang w:val="en-NL"/>
+            <w:pPr>
+              <w:rPr>
+                <w:rFonts w:ascii="Arial" w:hAnsi="Arial" w:cs="Arial"/>
+                <w:sz w:val="24"/>
+                <w:szCs w:val="24"/>
+              </w:rPr>
+            </w:pPr>
+            <w:r>
+              <w:rPr>
+                <w:rFonts w:ascii="Arial" w:hAnsi="Arial" w:cs="Arial"/>
+                <w:sz w:val="24"/>
+                <w:szCs w:val="24"/>
               </w:rPr>
               <w:t>Input (Should Have)</w:t>
             </w:r>
@@ -627,9 +1011,18 @@
             <w:tcW w:w="2254" w:type="dxa"/>
           </w:tcPr>
           <w:p>
-            <w:r>
-              <w:rPr>
-                <w:lang w:val="en-NL"/>
+            <w:pPr>
+              <w:rPr>
+                <w:rFonts w:ascii="Arial" w:hAnsi="Arial" w:cs="Arial"/>
+                <w:sz w:val="24"/>
+                <w:szCs w:val="24"/>
+              </w:rPr>
+            </w:pPr>
+            <w:r>
+              <w:rPr>
+                <w:rFonts w:ascii="Arial" w:hAnsi="Arial" w:cs="Arial"/>
+                <w:sz w:val="24"/>
+                <w:szCs w:val="24"/>
               </w:rPr>
               <w:t>Turn the potentiometer knob; verify the scope display zooms in and out accordingly.</w:t>
             </w:r>
@@ -640,7 +1033,19 @@
             <w:tcW w:w="2254" w:type="dxa"/>
           </w:tcPr>
           <w:p>
-            <w:r>
+            <w:pPr>
+              <w:rPr>
+                <w:rFonts w:ascii="Arial" w:hAnsi="Arial" w:cs="Arial"/>
+                <w:sz w:val="24"/>
+                <w:szCs w:val="24"/>
+              </w:rPr>
+            </w:pPr>
+            <w:r>
+              <w:rPr>
+                <w:rFonts w:ascii="Arial" w:hAnsi="Arial" w:cs="Arial"/>
+                <w:sz w:val="24"/>
+                <w:szCs w:val="24"/>
+              </w:rPr>
               <w:t>Not done</w:t>
             </w:r>
           </w:p>
@@ -652,11 +1057,20 @@
             <w:tcW w:w="2254" w:type="dxa"/>
           </w:tcPr>
           <w:p>
-            <w:r>
-              <w:rPr>
+            <w:pPr>
+              <w:rPr>
+                <w:rFonts w:ascii="Arial" w:hAnsi="Arial" w:cs="Arial"/>
+                <w:sz w:val="24"/>
+                <w:szCs w:val="24"/>
+              </w:rPr>
+            </w:pPr>
+            <w:r>
+              <w:rPr>
+                <w:rFonts w:ascii="Arial" w:hAnsi="Arial" w:cs="Arial"/>
                 <w:b/>
                 <w:bCs/>
-                <w:lang w:val="en-NL"/>
+                <w:sz w:val="24"/>
+                <w:szCs w:val="24"/>
               </w:rPr>
               <w:t>Fire Mode Switch</w:t>
             </w:r>
@@ -667,9 +1081,18 @@
             <w:tcW w:w="2254" w:type="dxa"/>
           </w:tcPr>
           <w:p>
-            <w:r>
-              <w:rPr>
-                <w:lang w:val="en-NL"/>
+            <w:pPr>
+              <w:rPr>
+                <w:rFonts w:ascii="Arial" w:hAnsi="Arial" w:cs="Arial"/>
+                <w:sz w:val="24"/>
+                <w:szCs w:val="24"/>
+              </w:rPr>
+            </w:pPr>
+            <w:r>
+              <w:rPr>
+                <w:rFonts w:ascii="Arial" w:hAnsi="Arial" w:cs="Arial"/>
+                <w:sz w:val="24"/>
+                <w:szCs w:val="24"/>
               </w:rPr>
               <w:t>Input (Should Have)</w:t>
             </w:r>
@@ -680,9 +1103,18 @@
             <w:tcW w:w="2254" w:type="dxa"/>
           </w:tcPr>
           <w:p>
-            <w:r>
-              <w:rPr>
-                <w:lang w:val="en-NL"/>
+            <w:pPr>
+              <w:rPr>
+                <w:rFonts w:ascii="Arial" w:hAnsi="Arial" w:cs="Arial"/>
+                <w:sz w:val="24"/>
+                <w:szCs w:val="24"/>
+              </w:rPr>
+            </w:pPr>
+            <w:r>
+              <w:rPr>
+                <w:rFonts w:ascii="Arial" w:hAnsi="Arial" w:cs="Arial"/>
+                <w:sz w:val="24"/>
+                <w:szCs w:val="24"/>
               </w:rPr>
               <w:t>Toggle the fire mode switch; verify the gun changes between single bullet, semi-auto, and auto firing modes.</w:t>
             </w:r>
@@ -693,7 +1125,19 @@
             <w:tcW w:w="2254" w:type="dxa"/>
           </w:tcPr>
           <w:p>
-            <w:r>
+            <w:pPr>
+              <w:rPr>
+                <w:rFonts w:ascii="Arial" w:hAnsi="Arial" w:cs="Arial"/>
+                <w:sz w:val="24"/>
+                <w:szCs w:val="24"/>
+              </w:rPr>
+            </w:pPr>
+            <w:r>
+              <w:rPr>
+                <w:rFonts w:ascii="Arial" w:hAnsi="Arial" w:cs="Arial"/>
+                <w:sz w:val="24"/>
+                <w:szCs w:val="24"/>
+              </w:rPr>
               <w:t>Not done</w:t>
             </w:r>
           </w:p>
@@ -705,11 +1149,20 @@
             <w:tcW w:w="2254" w:type="dxa"/>
           </w:tcPr>
           <w:p>
-            <w:r>
-              <w:rPr>
+            <w:pPr>
+              <w:rPr>
+                <w:rFonts w:ascii="Arial" w:hAnsi="Arial" w:cs="Arial"/>
+                <w:sz w:val="24"/>
+                <w:szCs w:val="24"/>
+              </w:rPr>
+            </w:pPr>
+            <w:r>
+              <w:rPr>
+                <w:rFonts w:ascii="Arial" w:hAnsi="Arial" w:cs="Arial"/>
                 <w:b/>
                 <w:bCs/>
-                <w:lang w:val="en-NL"/>
+                <w:sz w:val="24"/>
+                <w:szCs w:val="24"/>
               </w:rPr>
               <w:t>Moving Targets</w:t>
             </w:r>
@@ -720,9 +1173,18 @@
             <w:tcW w:w="2254" w:type="dxa"/>
           </w:tcPr>
           <w:p>
-            <w:r>
-              <w:rPr>
-                <w:lang w:val="en-NL"/>
+            <w:pPr>
+              <w:rPr>
+                <w:rFonts w:ascii="Arial" w:hAnsi="Arial" w:cs="Arial"/>
+                <w:sz w:val="24"/>
+                <w:szCs w:val="24"/>
+              </w:rPr>
+            </w:pPr>
+            <w:r>
+              <w:rPr>
+                <w:rFonts w:ascii="Arial" w:hAnsi="Arial" w:cs="Arial"/>
+                <w:sz w:val="24"/>
+                <w:szCs w:val="24"/>
               </w:rPr>
               <w:t>Software (Should Have)</w:t>
             </w:r>
@@ -733,20 +1195,51 @@
             <w:tcW w:w="2254" w:type="dxa"/>
           </w:tcPr>
           <w:p>
-            <w:r>
-              <w:rPr>
-                <w:lang w:val="en-NL"/>
-              </w:rPr>
-              <w:t>Verify that the targets (circles) actively move toward the player within the digital environment.</w:t>
-            </w:r>
-          </w:p>
-        </w:tc>
-        <w:tc>
-          <w:tcPr>
-            <w:tcW w:w="2254" w:type="dxa"/>
-          </w:tcPr>
-          <w:p>
-            <w:r>
+            <w:pPr>
+              <w:rPr>
+                <w:rFonts w:ascii="Arial" w:hAnsi="Arial" w:cs="Arial"/>
+                <w:sz w:val="24"/>
+                <w:szCs w:val="24"/>
+              </w:rPr>
+            </w:pPr>
+            <w:r>
+              <w:rPr>
+                <w:rFonts w:ascii="Arial" w:hAnsi="Arial" w:cs="Arial"/>
+                <w:sz w:val="24"/>
+                <w:szCs w:val="24"/>
+              </w:rPr>
+              <w:t xml:space="preserve">Verify that the targets (circles) actively move toward the player </w:t>
+            </w:r>
+            <w:r>
+              <w:rPr>
+                <w:rFonts w:ascii="Arial" w:hAnsi="Arial" w:cs="Arial"/>
+                <w:sz w:val="24"/>
+                <w:szCs w:val="24"/>
+              </w:rPr>
+              <w:lastRenderedPageBreak/>
+              <w:t>within the digital environment.</w:t>
+            </w:r>
+          </w:p>
+        </w:tc>
+        <w:tc>
+          <w:tcPr>
+            <w:tcW w:w="2254" w:type="dxa"/>
+          </w:tcPr>
+          <w:p>
+            <w:pPr>
+              <w:rPr>
+                <w:rFonts w:ascii="Arial" w:hAnsi="Arial" w:cs="Arial"/>
+                <w:sz w:val="24"/>
+                <w:szCs w:val="24"/>
+              </w:rPr>
+            </w:pPr>
+            <w:r>
+              <w:rPr>
+                <w:rFonts w:ascii="Arial" w:hAnsi="Arial" w:cs="Arial"/>
+                <w:sz w:val="24"/>
+                <w:szCs w:val="24"/>
+              </w:rPr>
+              <w:lastRenderedPageBreak/>
               <w:t>Done</w:t>
             </w:r>
           </w:p>
@@ -757,25 +1250,57 @@
           <w:tcPr>
             <w:tcW w:w="2254" w:type="dxa"/>
           </w:tcPr>
-          <w:p/>
-        </w:tc>
-        <w:tc>
-          <w:tcPr>
-            <w:tcW w:w="2254" w:type="dxa"/>
-          </w:tcPr>
-          <w:p/>
-        </w:tc>
-        <w:tc>
-          <w:tcPr>
-            <w:tcW w:w="2254" w:type="dxa"/>
-          </w:tcPr>
-          <w:p/>
-        </w:tc>
-        <w:tc>
-          <w:tcPr>
-            <w:tcW w:w="2254" w:type="dxa"/>
-          </w:tcPr>
-          <w:p/>
+          <w:p>
+            <w:pPr>
+              <w:rPr>
+                <w:rFonts w:ascii="Arial" w:hAnsi="Arial" w:cs="Arial"/>
+                <w:sz w:val="24"/>
+                <w:szCs w:val="24"/>
+              </w:rPr>
+            </w:pPr>
+          </w:p>
+        </w:tc>
+        <w:tc>
+          <w:tcPr>
+            <w:tcW w:w="2254" w:type="dxa"/>
+          </w:tcPr>
+          <w:p>
+            <w:pPr>
+              <w:rPr>
+                <w:rFonts w:ascii="Arial" w:hAnsi="Arial" w:cs="Arial"/>
+                <w:sz w:val="24"/>
+                <w:szCs w:val="24"/>
+              </w:rPr>
+            </w:pPr>
+          </w:p>
+        </w:tc>
+        <w:tc>
+          <w:tcPr>
+            <w:tcW w:w="2254" w:type="dxa"/>
+          </w:tcPr>
+          <w:p>
+            <w:pPr>
+              <w:rPr>
+                <w:rFonts w:ascii="Arial" w:hAnsi="Arial" w:cs="Arial"/>
+                <w:sz w:val="24"/>
+                <w:szCs w:val="24"/>
+              </w:rPr>
+            </w:pPr>
+          </w:p>
+        </w:tc>
+        <w:tc>
+          <w:tcPr>
+            <w:tcW w:w="2254" w:type="dxa"/>
+          </w:tcPr>
+          <w:p>
+            <w:pPr>
+              <w:rPr>
+                <w:rFonts w:ascii="Arial" w:hAnsi="Arial" w:cs="Arial"/>
+                <w:sz w:val="24"/>
+                <w:szCs w:val="24"/>
+              </w:rPr>
+            </w:pPr>
+          </w:p>
         </w:tc>
       </w:tr>
       <w:tr>
@@ -783,29 +1308,69 @@
           <w:tcPr>
             <w:tcW w:w="2254" w:type="dxa"/>
           </w:tcPr>
-          <w:p/>
-        </w:tc>
-        <w:tc>
-          <w:tcPr>
-            <w:tcW w:w="2254" w:type="dxa"/>
-          </w:tcPr>
-          <w:p/>
-        </w:tc>
-        <w:tc>
-          <w:tcPr>
-            <w:tcW w:w="2254" w:type="dxa"/>
-          </w:tcPr>
-          <w:p/>
-        </w:tc>
-        <w:tc>
-          <w:tcPr>
-            <w:tcW w:w="2254" w:type="dxa"/>
-          </w:tcPr>
-          <w:p/>
+          <w:p>
+            <w:pPr>
+              <w:rPr>
+                <w:rFonts w:ascii="Arial" w:hAnsi="Arial" w:cs="Arial"/>
+                <w:sz w:val="24"/>
+                <w:szCs w:val="24"/>
+              </w:rPr>
+            </w:pPr>
+          </w:p>
+        </w:tc>
+        <w:tc>
+          <w:tcPr>
+            <w:tcW w:w="2254" w:type="dxa"/>
+          </w:tcPr>
+          <w:p>
+            <w:pPr>
+              <w:rPr>
+                <w:rFonts w:ascii="Arial" w:hAnsi="Arial" w:cs="Arial"/>
+                <w:sz w:val="24"/>
+                <w:szCs w:val="24"/>
+              </w:rPr>
+            </w:pPr>
+          </w:p>
+        </w:tc>
+        <w:tc>
+          <w:tcPr>
+            <w:tcW w:w="2254" w:type="dxa"/>
+          </w:tcPr>
+          <w:p>
+            <w:pPr>
+              <w:rPr>
+                <w:rFonts w:ascii="Arial" w:hAnsi="Arial" w:cs="Arial"/>
+                <w:sz w:val="24"/>
+                <w:szCs w:val="24"/>
+              </w:rPr>
+            </w:pPr>
+          </w:p>
+        </w:tc>
+        <w:tc>
+          <w:tcPr>
+            <w:tcW w:w="2254" w:type="dxa"/>
+          </w:tcPr>
+          <w:p>
+            <w:pPr>
+              <w:rPr>
+                <w:rFonts w:ascii="Arial" w:hAnsi="Arial" w:cs="Arial"/>
+                <w:sz w:val="24"/>
+                <w:szCs w:val="24"/>
+              </w:rPr>
+            </w:pPr>
+          </w:p>
         </w:tc>
       </w:tr>
     </w:tbl>
-    <w:p/>
+    <w:p>
+      <w:pPr>
+        <w:rPr>
+          <w:rFonts w:ascii="Arial" w:hAnsi="Arial" w:cs="Arial"/>
+          <w:sz w:val="24"/>
+          <w:szCs w:val="24"/>
+        </w:rPr>
+      </w:pPr>
+    </w:p>
     <w:sectPr>
       <w:pgSz w:w="11906" w:h="16838"/>
       <w:pgMar w:top="1440" w:right="1440" w:bottom="1440" w:left="1440" w:header="708" w:footer="708" w:gutter="0"/>
@@ -1419,6 +1984,7 @@
   <w:style w:type="character" w:default="1" w:styleId="DefaultParagraphFont">
     <w:name w:val="Default Paragraph Font"/>
     <w:uiPriority w:val="1"/>
+    <w:semiHidden/>
     <w:unhideWhenUsed/>
   </w:style>
   <w:style w:type="table" w:default="1" w:styleId="TableNormal">

</xml_diff>